<commit_message>
Final video script (VO + image/animation prompts), live deployment details, refreshed report, deck and AI usage
Team 204 (code AYUCK), Cycle 3 grades 9-12.

Co-Authored-By: Claude Sonnet 5.5 <noreply@anthropic.com>
</commit_message>
<xml_diff>
--- a/docs/WASL-Arena-Technical-Report.docx
+++ b/docs/WASL-Arena-Technical-Report.docx
@@ -2342,7 +2342,7 @@
           <w:i w:val="0"/>
           <w:sz w:val="21"/>
         </w:rPr>
-        <w:t>, and re-seal the report while preserving the original AI seal. The stand-alone judge (`python -m app.judge_cli`) produces the same sealed report outside the app, satisfying the brief's second connection option.</w:t>
+        <w:t>, and re-seal the report while preserving the original AI seal. The stand-alone judge (python -m app.judge_cli) produces the same sealed report outside the app, satisfying the brief's second connection option.</w:t>
       </w:r>
     </w:p>
     <w:p>
@@ -4380,7 +4380,55 @@
           <w:i w:val="0"/>
           <w:sz w:val="21"/>
         </w:rPr>
-        <w:t xml:space="preserve"> holds frontend, backend, tests, tools, documentation and AI-usage records. The React app deploys from GitHub to Vercel (`frontend/vercel.json`, `VITE_API_URL`); the FastAPI judge deploys to Render (`render.yaml`) because video processing needs a long-running Python runtime with FFmpeg and OpenCV. Production build verified locally (TypeScript clean, Vite build). Live URLs are recorded in the README once the accounts are connected; publication is not claimed here until verified.</w:t>
+        <w:t xml:space="preserve"> (GitHub, private) holds frontend, backend, tests, tools, documentation and AI-usage records. The React app is deployed from GitHub to </w:t>
+      </w:r>
+      <w:r>
+        <w:rPr>
+          <w:b/>
+          <w:i w:val="0"/>
+          <w:sz w:val="21"/>
+        </w:rPr>
+        <w:t>Vercel</w:t>
+      </w:r>
+      <w:r>
+        <w:rPr>
+          <w:b w:val="0"/>
+          <w:i w:val="0"/>
+          <w:sz w:val="21"/>
+        </w:rPr>
+        <w:t xml:space="preserve"> (https://frontend-three-fawn-47.vercel.app) and the FastAPI judge to </w:t>
+      </w:r>
+      <w:r>
+        <w:rPr>
+          <w:b/>
+          <w:i w:val="0"/>
+          <w:sz w:val="21"/>
+        </w:rPr>
+        <w:t>Render</w:t>
+      </w:r>
+      <w:r>
+        <w:rPr>
+          <w:b w:val="0"/>
+          <w:i w:val="0"/>
+          <w:sz w:val="21"/>
+        </w:rPr>
+        <w:t xml:space="preserve"> (https://wasl-arena.onrender.com), because video processing needs a long-running Python runtime with FFmpeg and OpenCV. The frontend reaches the judge through VITE_API_URL; all credentials are server-side environment variables. </w:t>
+      </w:r>
+      <w:r>
+        <w:rPr>
+          <w:b/>
+          <w:i w:val="0"/>
+          <w:sz w:val="21"/>
+        </w:rPr>
+        <w:t>Verified on the live deployment:</w:t>
+      </w:r>
+      <w:r>
+        <w:rPr>
+          <w:b w:val="0"/>
+          <w:i w:val="0"/>
+          <w:sz w:val="21"/>
+        </w:rPr>
+        <w:t xml:space="preserve"> every route and static asset returns HTTP 200; the header badge reads “AI judge online”; /api/health reports transcription configured; a Falaj fixture uploaded to the live judge completed all stages and scored 11 (3 farms, 0 leaks, +2 bonus) with a valid integrity seal; and CORS accepts only the Vercel origin. Free-tier hosting sleeps when idle and does not persist uploads, so the first request can take about 30 s.</w:t>
       </w:r>
     </w:p>
     <w:p>

</xml_diff>